<commit_message>
feat: add EVENT_WITNESSES block to WriteOffOrder report
Add witnesses-of-event section across all layers: WriteOffWitnessData
domain model, IWriteOffOrderReportData/WriteOffOrderReportData extended
with Witnesses collection, BuildWitnessesBlock helper formatting each
witness as '- {rank} {NAME}, {position}.', WriteOffWitnessViewModel +
AddWitnessCommand/RemoveWitnessCommand in the VM, and a DataGrid section
at the bottom of the left panel in WriteOffOrderView.

Also includes Phase 4 fixes: ReplaceFieldWithBlock duplicate-field bug,
WriteOffOrderTemplate.docx csproj CopyToOutputDirectory entry, and
WriteOffOrderReportTests (79 tests, 0 failed).

Co-Authored-By: Claude Sonnet 4.6 <noreply@anthropic.com>
</commit_message>
<xml_diff>
--- a/Mil.Paperwork.Domain/Templates/WriteOffOrderTemplate.docx
+++ b/Mil.Paperwork.Domain/Templates/WriteOffOrderTemplate.docx
@@ -529,10 +529,10 @@
           <w:lang w:val="en-US"/>
         </w:rPr>
       </w:pPr>
-      <w:bookmarkStart w:id="3" w:name="_Hlk205021906"/>
-      <w:bookmarkStart w:id="4" w:name="_Hlk206511887"/>
-      <w:bookmarkStart w:id="5" w:name="_Hlk210635222"/>
-      <w:bookmarkStart w:id="6" w:name="_Hlk211254229"/>
+      <w:bookmarkStart w:id="3" w:name="_Hlk211254229"/>
+      <w:bookmarkStart w:id="4" w:name="_Hlk205021906"/>
+      <w:bookmarkStart w:id="5" w:name="_Hlk206511887"/>
+      <w:bookmarkStart w:id="6" w:name="_Hlk210635222"/>
       <w:r>
         <w:rPr>
           <w:sz w:val="28"/>
@@ -1324,7 +1324,7 @@
         </w:rPr>
       </w:pPr>
     </w:p>
-    <w:bookmarkEnd w:id="6"/>
+    <w:bookmarkEnd w:id="3"/>
     <w:p>
       <w:pPr>
         <w:pStyle w:val="a7"/>
@@ -1891,218 +1891,61 @@
         <w:rPr>
           <w:sz w:val="28"/>
           <w:szCs w:val="28"/>
-          <w:highlight w:val="yellow"/>
-          <w:lang w:val="ru-RU"/>
-        </w:rPr>
-      </w:pPr>
-      <w:r>
-        <w:rPr>
-          <w:sz w:val="28"/>
-          <w:szCs w:val="28"/>
-          <w:highlight w:val="yellow"/>
-          <w:lang w:val="ru-RU"/>
-        </w:rPr>
-        <w:t xml:space="preserve">- </w:t>
-      </w:r>
-      <w:proofErr w:type="spellStart"/>
-      <w:r>
-        <w:rPr>
-          <w:sz w:val="28"/>
-          <w:szCs w:val="28"/>
-          <w:highlight w:val="yellow"/>
-          <w:lang w:val="ru-RU"/>
-        </w:rPr>
-        <w:t>молодший</w:t>
-      </w:r>
-      <w:proofErr w:type="spellEnd"/>
-      <w:r>
-        <w:rPr>
-          <w:sz w:val="28"/>
-          <w:szCs w:val="28"/>
-          <w:highlight w:val="yellow"/>
-          <w:lang w:val="ru-RU"/>
-        </w:rPr>
-        <w:t xml:space="preserve"> сержант УДАЛОВ </w:t>
-      </w:r>
-      <w:proofErr w:type="spellStart"/>
-      <w:r>
-        <w:rPr>
-          <w:sz w:val="28"/>
-          <w:szCs w:val="28"/>
-          <w:highlight w:val="yellow"/>
-          <w:lang w:val="ru-RU"/>
-        </w:rPr>
-        <w:t>Володимир</w:t>
-      </w:r>
-      <w:proofErr w:type="spellEnd"/>
-      <w:r>
-        <w:rPr>
-          <w:sz w:val="28"/>
-          <w:szCs w:val="28"/>
-          <w:highlight w:val="yellow"/>
+        </w:rPr>
+      </w:pPr>
+      <w:r>
+        <w:rPr>
+          <w:color w:val="000000"/>
+          <w:sz w:val="28"/>
+          <w:szCs w:val="28"/>
+          <w:lang w:val="ru-RU" w:eastAsia="en-US"/>
+        </w:rPr>
+        <w:fldChar w:fldCharType="begin"/>
+      </w:r>
+      <w:r>
+        <w:rPr>
+          <w:color w:val="000000"/>
+          <w:sz w:val="28"/>
+          <w:szCs w:val="28"/>
+          <w:lang w:val="ru-RU" w:eastAsia="en-US"/>
+        </w:rPr>
+        <w:instrText xml:space="preserve"> MERGEFIELD  EVENT_WITNESSES  \* MERGEFORMAT </w:instrText>
+      </w:r>
+      <w:r>
+        <w:rPr>
+          <w:color w:val="000000"/>
+          <w:sz w:val="28"/>
+          <w:szCs w:val="28"/>
+          <w:lang w:val="ru-RU" w:eastAsia="en-US"/>
+        </w:rPr>
+        <w:fldChar w:fldCharType="separate"/>
+      </w:r>
+      <w:r>
+        <w:rPr>
+          <w:noProof/>
+          <w:color w:val="000000"/>
+          <w:sz w:val="28"/>
+          <w:szCs w:val="28"/>
+          <w:lang w:val="ru-RU" w:eastAsia="en-US"/>
+        </w:rPr>
+        <w:t>«EVENT_WITNESSES»</w:t>
+      </w:r>
+      <w:r>
+        <w:rPr>
+          <w:color w:val="000000"/>
+          <w:sz w:val="28"/>
+          <w:szCs w:val="28"/>
+          <w:lang w:val="ru-RU" w:eastAsia="en-US"/>
+        </w:rPr>
+        <w:fldChar w:fldCharType="end"/>
+      </w:r>
+      <w:r>
+        <w:rPr>
+          <w:sz w:val="28"/>
+          <w:szCs w:val="28"/>
           <w:lang w:val="ru-RU"/>
         </w:rPr>
         <w:t xml:space="preserve"> </w:t>
-      </w:r>
-      <w:proofErr w:type="spellStart"/>
-      <w:r>
-        <w:rPr>
-          <w:sz w:val="28"/>
-          <w:szCs w:val="28"/>
-          <w:highlight w:val="yellow"/>
-          <w:lang w:val="ru-RU"/>
-        </w:rPr>
-        <w:t>Віталійович</w:t>
-      </w:r>
-      <w:proofErr w:type="spellEnd"/>
-      <w:r>
-        <w:rPr>
-          <w:sz w:val="28"/>
-          <w:szCs w:val="28"/>
-          <w:highlight w:val="yellow"/>
-          <w:lang w:val="ru-RU"/>
-        </w:rPr>
-        <w:t xml:space="preserve">, командир </w:t>
-      </w:r>
-      <w:proofErr w:type="spellStart"/>
-      <w:r>
-        <w:rPr>
-          <w:sz w:val="28"/>
-          <w:szCs w:val="28"/>
-          <w:highlight w:val="yellow"/>
-          <w:lang w:val="ru-RU"/>
-        </w:rPr>
-        <w:t>міномета</w:t>
-      </w:r>
-      <w:proofErr w:type="spellEnd"/>
-      <w:r>
-        <w:rPr>
-          <w:sz w:val="28"/>
-          <w:szCs w:val="28"/>
-          <w:highlight w:val="yellow"/>
-          <w:lang w:val="ru-RU"/>
-        </w:rPr>
-        <w:t xml:space="preserve"> </w:t>
-      </w:r>
-      <w:proofErr w:type="spellStart"/>
-      <w:r>
-        <w:rPr>
-          <w:sz w:val="28"/>
-          <w:szCs w:val="28"/>
-          <w:highlight w:val="yellow"/>
-          <w:lang w:val="ru-RU"/>
-        </w:rPr>
-        <w:t>мінометного</w:t>
-      </w:r>
-      <w:proofErr w:type="spellEnd"/>
-      <w:r>
-        <w:rPr>
-          <w:sz w:val="28"/>
-          <w:szCs w:val="28"/>
-          <w:highlight w:val="yellow"/>
-          <w:lang w:val="ru-RU"/>
-        </w:rPr>
-        <w:t xml:space="preserve"> взводу </w:t>
-      </w:r>
-      <w:proofErr w:type="spellStart"/>
-      <w:r>
-        <w:rPr>
-          <w:sz w:val="28"/>
-          <w:szCs w:val="28"/>
-          <w:highlight w:val="yellow"/>
-          <w:lang w:val="ru-RU"/>
-        </w:rPr>
-        <w:t>роти</w:t>
-      </w:r>
-      <w:proofErr w:type="spellEnd"/>
-      <w:r>
-        <w:rPr>
-          <w:sz w:val="28"/>
-          <w:szCs w:val="28"/>
-          <w:highlight w:val="yellow"/>
-          <w:lang w:val="ru-RU"/>
-        </w:rPr>
-        <w:t xml:space="preserve"> </w:t>
-      </w:r>
-      <w:proofErr w:type="spellStart"/>
-      <w:r>
-        <w:rPr>
-          <w:sz w:val="28"/>
-          <w:szCs w:val="28"/>
-          <w:highlight w:val="yellow"/>
-          <w:lang w:val="ru-RU"/>
-        </w:rPr>
-        <w:t>вогневої</w:t>
-      </w:r>
-      <w:proofErr w:type="spellEnd"/>
-      <w:r>
-        <w:rPr>
-          <w:sz w:val="28"/>
-          <w:szCs w:val="28"/>
-          <w:highlight w:val="yellow"/>
-          <w:lang w:val="ru-RU"/>
-        </w:rPr>
-        <w:t xml:space="preserve"> </w:t>
-      </w:r>
-      <w:proofErr w:type="spellStart"/>
-      <w:r>
-        <w:rPr>
-          <w:sz w:val="28"/>
-          <w:szCs w:val="28"/>
-          <w:highlight w:val="yellow"/>
-          <w:lang w:val="ru-RU"/>
-        </w:rPr>
-        <w:t>підтримки</w:t>
-      </w:r>
-      <w:proofErr w:type="spellEnd"/>
-      <w:r>
-        <w:rPr>
-          <w:sz w:val="28"/>
-          <w:szCs w:val="28"/>
-          <w:highlight w:val="yellow"/>
-          <w:lang w:val="ru-RU"/>
-        </w:rPr>
-        <w:t xml:space="preserve"> </w:t>
-      </w:r>
-      <w:proofErr w:type="spellStart"/>
-      <w:r>
-        <w:rPr>
-          <w:sz w:val="28"/>
-          <w:szCs w:val="28"/>
-          <w:highlight w:val="yellow"/>
-          <w:lang w:val="ru-RU"/>
-        </w:rPr>
-        <w:t>військової</w:t>
-      </w:r>
-      <w:proofErr w:type="spellEnd"/>
-      <w:r>
-        <w:rPr>
-          <w:sz w:val="28"/>
-          <w:szCs w:val="28"/>
-          <w:highlight w:val="yellow"/>
-          <w:lang w:val="ru-RU"/>
-        </w:rPr>
-        <w:t xml:space="preserve"> </w:t>
-      </w:r>
-      <w:proofErr w:type="spellStart"/>
-      <w:r>
-        <w:rPr>
-          <w:sz w:val="28"/>
-          <w:szCs w:val="28"/>
-          <w:highlight w:val="yellow"/>
-          <w:lang w:val="ru-RU"/>
-        </w:rPr>
-        <w:t>частини</w:t>
-      </w:r>
-      <w:proofErr w:type="spellEnd"/>
-      <w:r>
-        <w:rPr>
-          <w:sz w:val="28"/>
-          <w:szCs w:val="28"/>
-          <w:highlight w:val="yellow"/>
-          <w:lang w:val="ru-RU"/>
-        </w:rPr>
-        <w:t xml:space="preserve"> А4682.</w:t>
       </w:r>
     </w:p>
     <w:p>
@@ -2113,520 +1956,6 @@
         <w:rPr>
           <w:sz w:val="28"/>
           <w:szCs w:val="28"/>
-          <w:highlight w:val="yellow"/>
-          <w:lang w:val="ru-RU"/>
-        </w:rPr>
-      </w:pPr>
-      <w:r>
-        <w:rPr>
-          <w:sz w:val="28"/>
-          <w:szCs w:val="28"/>
-          <w:highlight w:val="yellow"/>
-          <w:lang w:val="ru-RU"/>
-        </w:rPr>
-        <w:t xml:space="preserve">- старший солдат КОВАЛЬОВ Дмитро Миколайович, </w:t>
-      </w:r>
-      <w:proofErr w:type="spellStart"/>
-      <w:r>
-        <w:rPr>
-          <w:sz w:val="28"/>
-          <w:szCs w:val="28"/>
-          <w:highlight w:val="yellow"/>
-          <w:lang w:val="ru-RU"/>
-        </w:rPr>
-        <w:t>майстер</w:t>
-      </w:r>
-      <w:proofErr w:type="spellEnd"/>
-      <w:r>
-        <w:rPr>
-          <w:sz w:val="28"/>
-          <w:szCs w:val="28"/>
-          <w:highlight w:val="yellow"/>
-          <w:lang w:val="ru-RU"/>
-        </w:rPr>
-        <w:t xml:space="preserve"> – номер обслуги </w:t>
-      </w:r>
-      <w:proofErr w:type="spellStart"/>
-      <w:r>
-        <w:rPr>
-          <w:sz w:val="28"/>
-          <w:szCs w:val="28"/>
-          <w:highlight w:val="yellow"/>
-          <w:lang w:val="ru-RU"/>
-        </w:rPr>
-        <w:t>мінометного</w:t>
-      </w:r>
-      <w:proofErr w:type="spellEnd"/>
-      <w:r>
-        <w:rPr>
-          <w:sz w:val="28"/>
-          <w:szCs w:val="28"/>
-          <w:highlight w:val="yellow"/>
-          <w:lang w:val="ru-RU"/>
-        </w:rPr>
-        <w:t xml:space="preserve"> взводу </w:t>
-      </w:r>
-      <w:proofErr w:type="spellStart"/>
-      <w:r>
-        <w:rPr>
-          <w:sz w:val="28"/>
-          <w:szCs w:val="28"/>
-          <w:highlight w:val="yellow"/>
-          <w:lang w:val="ru-RU"/>
-        </w:rPr>
-        <w:t>роти</w:t>
-      </w:r>
-      <w:proofErr w:type="spellEnd"/>
-      <w:r>
-        <w:rPr>
-          <w:sz w:val="28"/>
-          <w:szCs w:val="28"/>
-          <w:highlight w:val="yellow"/>
-          <w:lang w:val="ru-RU"/>
-        </w:rPr>
-        <w:t xml:space="preserve"> </w:t>
-      </w:r>
-      <w:proofErr w:type="spellStart"/>
-      <w:r>
-        <w:rPr>
-          <w:sz w:val="28"/>
-          <w:szCs w:val="28"/>
-          <w:highlight w:val="yellow"/>
-          <w:lang w:val="ru-RU"/>
-        </w:rPr>
-        <w:t>вогневої</w:t>
-      </w:r>
-      <w:proofErr w:type="spellEnd"/>
-      <w:r>
-        <w:rPr>
-          <w:sz w:val="28"/>
-          <w:szCs w:val="28"/>
-          <w:highlight w:val="yellow"/>
-          <w:lang w:val="ru-RU"/>
-        </w:rPr>
-        <w:t xml:space="preserve"> </w:t>
-      </w:r>
-      <w:proofErr w:type="spellStart"/>
-      <w:r>
-        <w:rPr>
-          <w:sz w:val="28"/>
-          <w:szCs w:val="28"/>
-          <w:highlight w:val="yellow"/>
-          <w:lang w:val="ru-RU"/>
-        </w:rPr>
-        <w:t>підтримки</w:t>
-      </w:r>
-      <w:proofErr w:type="spellEnd"/>
-      <w:r>
-        <w:rPr>
-          <w:sz w:val="28"/>
-          <w:szCs w:val="28"/>
-          <w:highlight w:val="yellow"/>
-          <w:lang w:val="ru-RU"/>
-        </w:rPr>
-        <w:t xml:space="preserve"> </w:t>
-      </w:r>
-      <w:proofErr w:type="spellStart"/>
-      <w:r>
-        <w:rPr>
-          <w:sz w:val="28"/>
-          <w:szCs w:val="28"/>
-          <w:highlight w:val="yellow"/>
-          <w:lang w:val="ru-RU"/>
-        </w:rPr>
-        <w:t>військової</w:t>
-      </w:r>
-      <w:proofErr w:type="spellEnd"/>
-      <w:r>
-        <w:rPr>
-          <w:sz w:val="28"/>
-          <w:szCs w:val="28"/>
-          <w:highlight w:val="yellow"/>
-          <w:lang w:val="ru-RU"/>
-        </w:rPr>
-        <w:t xml:space="preserve"> </w:t>
-      </w:r>
-      <w:proofErr w:type="spellStart"/>
-      <w:r>
-        <w:rPr>
-          <w:sz w:val="28"/>
-          <w:szCs w:val="28"/>
-          <w:highlight w:val="yellow"/>
-          <w:lang w:val="ru-RU"/>
-        </w:rPr>
-        <w:t>частини</w:t>
-      </w:r>
-      <w:proofErr w:type="spellEnd"/>
-      <w:r>
-        <w:rPr>
-          <w:sz w:val="28"/>
-          <w:szCs w:val="28"/>
-          <w:highlight w:val="yellow"/>
-          <w:lang w:val="ru-RU"/>
-        </w:rPr>
-        <w:t xml:space="preserve"> А4682.</w:t>
-      </w:r>
-    </w:p>
-    <w:p>
-      <w:pPr>
-        <w:spacing w:line="252" w:lineRule="auto"/>
-        <w:ind w:firstLine="709"/>
-        <w:jc w:val="both"/>
-        <w:rPr>
-          <w:sz w:val="28"/>
-          <w:szCs w:val="28"/>
-          <w:highlight w:val="yellow"/>
-          <w:lang w:val="ru-RU"/>
-        </w:rPr>
-      </w:pPr>
-      <w:r>
-        <w:rPr>
-          <w:sz w:val="28"/>
-          <w:szCs w:val="28"/>
-          <w:highlight w:val="yellow"/>
-          <w:lang w:val="ru-RU"/>
-        </w:rPr>
-        <w:lastRenderedPageBreak/>
-        <w:t xml:space="preserve">- солдат ПІТУТІН </w:t>
-      </w:r>
-      <w:proofErr w:type="spellStart"/>
-      <w:r>
-        <w:rPr>
-          <w:sz w:val="28"/>
-          <w:szCs w:val="28"/>
-          <w:highlight w:val="yellow"/>
-          <w:lang w:val="ru-RU"/>
-        </w:rPr>
-        <w:t>Євген</w:t>
-      </w:r>
-      <w:proofErr w:type="spellEnd"/>
-      <w:r>
-        <w:rPr>
-          <w:sz w:val="28"/>
-          <w:szCs w:val="28"/>
-          <w:highlight w:val="yellow"/>
-          <w:lang w:val="ru-RU"/>
-        </w:rPr>
-        <w:t xml:space="preserve"> Миколайович, старший </w:t>
-      </w:r>
-      <w:proofErr w:type="spellStart"/>
-      <w:r>
-        <w:rPr>
-          <w:sz w:val="28"/>
-          <w:szCs w:val="28"/>
-          <w:highlight w:val="yellow"/>
-          <w:lang w:val="ru-RU"/>
-        </w:rPr>
-        <w:t>навідник</w:t>
-      </w:r>
-      <w:proofErr w:type="spellEnd"/>
-      <w:r>
-        <w:rPr>
-          <w:sz w:val="28"/>
-          <w:szCs w:val="28"/>
-          <w:highlight w:val="yellow"/>
-          <w:lang w:val="ru-RU"/>
-        </w:rPr>
-        <w:t xml:space="preserve"> </w:t>
-      </w:r>
-      <w:proofErr w:type="spellStart"/>
-      <w:r>
-        <w:rPr>
-          <w:sz w:val="28"/>
-          <w:szCs w:val="28"/>
-          <w:highlight w:val="yellow"/>
-          <w:lang w:val="ru-RU"/>
-        </w:rPr>
-        <w:t>мінометного</w:t>
-      </w:r>
-      <w:proofErr w:type="spellEnd"/>
-      <w:r>
-        <w:rPr>
-          <w:sz w:val="28"/>
-          <w:szCs w:val="28"/>
-          <w:highlight w:val="yellow"/>
-          <w:lang w:val="ru-RU"/>
-        </w:rPr>
-        <w:t xml:space="preserve"> взводу </w:t>
-      </w:r>
-      <w:proofErr w:type="spellStart"/>
-      <w:r>
-        <w:rPr>
-          <w:sz w:val="28"/>
-          <w:szCs w:val="28"/>
-          <w:highlight w:val="yellow"/>
-          <w:lang w:val="ru-RU"/>
-        </w:rPr>
-        <w:t>роти</w:t>
-      </w:r>
-      <w:proofErr w:type="spellEnd"/>
-      <w:r>
-        <w:rPr>
-          <w:sz w:val="28"/>
-          <w:szCs w:val="28"/>
-          <w:highlight w:val="yellow"/>
-          <w:lang w:val="ru-RU"/>
-        </w:rPr>
-        <w:t xml:space="preserve"> </w:t>
-      </w:r>
-      <w:proofErr w:type="spellStart"/>
-      <w:r>
-        <w:rPr>
-          <w:sz w:val="28"/>
-          <w:szCs w:val="28"/>
-          <w:highlight w:val="yellow"/>
-          <w:lang w:val="ru-RU"/>
-        </w:rPr>
-        <w:t>вогневої</w:t>
-      </w:r>
-      <w:proofErr w:type="spellEnd"/>
-      <w:r>
-        <w:rPr>
-          <w:sz w:val="28"/>
-          <w:szCs w:val="28"/>
-          <w:highlight w:val="yellow"/>
-          <w:lang w:val="ru-RU"/>
-        </w:rPr>
-        <w:t xml:space="preserve"> </w:t>
-      </w:r>
-      <w:proofErr w:type="spellStart"/>
-      <w:r>
-        <w:rPr>
-          <w:sz w:val="28"/>
-          <w:szCs w:val="28"/>
-          <w:highlight w:val="yellow"/>
-          <w:lang w:val="ru-RU"/>
-        </w:rPr>
-        <w:t>підтримки</w:t>
-      </w:r>
-      <w:proofErr w:type="spellEnd"/>
-      <w:r>
-        <w:rPr>
-          <w:sz w:val="28"/>
-          <w:szCs w:val="28"/>
-          <w:highlight w:val="yellow"/>
-          <w:lang w:val="ru-RU"/>
-        </w:rPr>
-        <w:t xml:space="preserve"> </w:t>
-      </w:r>
-      <w:proofErr w:type="spellStart"/>
-      <w:r>
-        <w:rPr>
-          <w:sz w:val="28"/>
-          <w:szCs w:val="28"/>
-          <w:highlight w:val="yellow"/>
-          <w:lang w:val="ru-RU"/>
-        </w:rPr>
-        <w:t>військової</w:t>
-      </w:r>
-      <w:proofErr w:type="spellEnd"/>
-      <w:r>
-        <w:rPr>
-          <w:sz w:val="28"/>
-          <w:szCs w:val="28"/>
-          <w:highlight w:val="yellow"/>
-          <w:lang w:val="ru-RU"/>
-        </w:rPr>
-        <w:t xml:space="preserve"> </w:t>
-      </w:r>
-      <w:proofErr w:type="spellStart"/>
-      <w:r>
-        <w:rPr>
-          <w:sz w:val="28"/>
-          <w:szCs w:val="28"/>
-          <w:highlight w:val="yellow"/>
-          <w:lang w:val="ru-RU"/>
-        </w:rPr>
-        <w:t>частини</w:t>
-      </w:r>
-      <w:proofErr w:type="spellEnd"/>
-      <w:r>
-        <w:rPr>
-          <w:sz w:val="28"/>
-          <w:szCs w:val="28"/>
-          <w:highlight w:val="yellow"/>
-          <w:lang w:val="ru-RU"/>
-        </w:rPr>
-        <w:t xml:space="preserve"> А4682.</w:t>
-      </w:r>
-    </w:p>
-    <w:p>
-      <w:pPr>
-        <w:spacing w:line="252" w:lineRule="auto"/>
-        <w:ind w:firstLine="709"/>
-        <w:jc w:val="both"/>
-        <w:rPr>
-          <w:sz w:val="28"/>
-          <w:szCs w:val="28"/>
-          <w:lang w:val="ru-RU"/>
-        </w:rPr>
-      </w:pPr>
-      <w:r>
-        <w:rPr>
-          <w:sz w:val="28"/>
-          <w:szCs w:val="28"/>
-          <w:highlight w:val="yellow"/>
-          <w:lang w:val="ru-RU"/>
-        </w:rPr>
-        <w:t xml:space="preserve">- старший солдат БОРШКІВСЬКИЙ Богдан </w:t>
-      </w:r>
-      <w:proofErr w:type="spellStart"/>
-      <w:r>
-        <w:rPr>
-          <w:sz w:val="28"/>
-          <w:szCs w:val="28"/>
-          <w:highlight w:val="yellow"/>
-          <w:lang w:val="ru-RU"/>
-        </w:rPr>
-        <w:t>Анатолійович</w:t>
-      </w:r>
-      <w:proofErr w:type="spellEnd"/>
-      <w:r>
-        <w:rPr>
-          <w:sz w:val="28"/>
-          <w:szCs w:val="28"/>
-          <w:highlight w:val="yellow"/>
-          <w:lang w:val="ru-RU"/>
-        </w:rPr>
-        <w:t xml:space="preserve">, номер обслуги </w:t>
-      </w:r>
-      <w:proofErr w:type="spellStart"/>
-      <w:r>
-        <w:rPr>
-          <w:sz w:val="28"/>
-          <w:szCs w:val="28"/>
-          <w:highlight w:val="yellow"/>
-          <w:lang w:val="ru-RU"/>
-        </w:rPr>
-        <w:t>мінометного</w:t>
-      </w:r>
-      <w:proofErr w:type="spellEnd"/>
-      <w:r>
-        <w:rPr>
-          <w:sz w:val="28"/>
-          <w:szCs w:val="28"/>
-          <w:highlight w:val="yellow"/>
-          <w:lang w:val="ru-RU"/>
-        </w:rPr>
-        <w:t xml:space="preserve"> взводу </w:t>
-      </w:r>
-      <w:proofErr w:type="spellStart"/>
-      <w:r>
-        <w:rPr>
-          <w:sz w:val="28"/>
-          <w:szCs w:val="28"/>
-          <w:highlight w:val="yellow"/>
-          <w:lang w:val="ru-RU"/>
-        </w:rPr>
-        <w:t>роти</w:t>
-      </w:r>
-      <w:proofErr w:type="spellEnd"/>
-      <w:r>
-        <w:rPr>
-          <w:sz w:val="28"/>
-          <w:szCs w:val="28"/>
-          <w:highlight w:val="yellow"/>
-          <w:lang w:val="ru-RU"/>
-        </w:rPr>
-        <w:t xml:space="preserve"> </w:t>
-      </w:r>
-      <w:proofErr w:type="spellStart"/>
-      <w:r>
-        <w:rPr>
-          <w:sz w:val="28"/>
-          <w:szCs w:val="28"/>
-          <w:highlight w:val="yellow"/>
-          <w:lang w:val="ru-RU"/>
-        </w:rPr>
-        <w:t>вогневої</w:t>
-      </w:r>
-      <w:proofErr w:type="spellEnd"/>
-      <w:r>
-        <w:rPr>
-          <w:sz w:val="28"/>
-          <w:szCs w:val="28"/>
-          <w:highlight w:val="yellow"/>
-          <w:lang w:val="ru-RU"/>
-        </w:rPr>
-        <w:t xml:space="preserve"> </w:t>
-      </w:r>
-      <w:proofErr w:type="spellStart"/>
-      <w:r>
-        <w:rPr>
-          <w:sz w:val="28"/>
-          <w:szCs w:val="28"/>
-          <w:highlight w:val="yellow"/>
-          <w:lang w:val="ru-RU"/>
-        </w:rPr>
-        <w:t>підтримки</w:t>
-      </w:r>
-      <w:proofErr w:type="spellEnd"/>
-      <w:r>
-        <w:rPr>
-          <w:sz w:val="28"/>
-          <w:szCs w:val="28"/>
-          <w:highlight w:val="yellow"/>
-          <w:lang w:val="ru-RU"/>
-        </w:rPr>
-        <w:t xml:space="preserve"> </w:t>
-      </w:r>
-      <w:proofErr w:type="spellStart"/>
-      <w:r>
-        <w:rPr>
-          <w:sz w:val="28"/>
-          <w:szCs w:val="28"/>
-          <w:highlight w:val="yellow"/>
-          <w:lang w:val="ru-RU"/>
-        </w:rPr>
-        <w:t>військової</w:t>
-      </w:r>
-      <w:proofErr w:type="spellEnd"/>
-      <w:r>
-        <w:rPr>
-          <w:sz w:val="28"/>
-          <w:szCs w:val="28"/>
-          <w:highlight w:val="yellow"/>
-          <w:lang w:val="ru-RU"/>
-        </w:rPr>
-        <w:t xml:space="preserve"> </w:t>
-      </w:r>
-      <w:proofErr w:type="spellStart"/>
-      <w:r>
-        <w:rPr>
-          <w:sz w:val="28"/>
-          <w:szCs w:val="28"/>
-          <w:highlight w:val="yellow"/>
-          <w:lang w:val="ru-RU"/>
-        </w:rPr>
-        <w:t>частини</w:t>
-      </w:r>
-      <w:proofErr w:type="spellEnd"/>
-      <w:r>
-        <w:rPr>
-          <w:sz w:val="28"/>
-          <w:szCs w:val="28"/>
-          <w:highlight w:val="yellow"/>
-          <w:lang w:val="ru-RU"/>
-        </w:rPr>
-        <w:t xml:space="preserve"> А4682.</w:t>
-      </w:r>
-      <w:r>
-        <w:rPr>
-          <w:sz w:val="28"/>
-          <w:szCs w:val="28"/>
-          <w:lang w:val="ru-RU"/>
-        </w:rPr>
-        <w:t xml:space="preserve"> </w:t>
-      </w:r>
-    </w:p>
-    <w:p>
-      <w:pPr>
-        <w:spacing w:line="252" w:lineRule="auto"/>
-        <w:ind w:firstLine="709"/>
-        <w:jc w:val="both"/>
-        <w:rPr>
-          <w:sz w:val="28"/>
-          <w:szCs w:val="28"/>
           <w:lang w:val="ru-RU"/>
         </w:rPr>
       </w:pPr>
@@ -2760,6 +2089,7 @@
           <w:sz w:val="28"/>
           <w:szCs w:val="28"/>
         </w:rPr>
+        <w:lastRenderedPageBreak/>
         <w:t xml:space="preserve">Відповідно до вимог Порядку списання військового майна у Збройних Силах України та Державній спеціальній службі транспорту, затвердженого наказом Міністерства оборони України від 29 березня 2021 № 81 (зі змінами), </w:t>
       </w:r>
       <w:bookmarkEnd w:id="8"/>
@@ -2770,7 +2100,7 @@
         </w:rPr>
         <w:t xml:space="preserve"> Закону України "Про матеріальну відповідальність військовослужбовців та прирівняних до них осіб за шкоду, завдану державі" від 03 жовтня 2019 року №160-ІХ, </w:t>
       </w:r>
-      <w:bookmarkEnd w:id="3"/>
+      <w:bookmarkEnd w:id="4"/>
       <w:r>
         <w:rPr>
           <w:sz w:val="28"/>
@@ -2778,7 +2108,7 @@
         </w:rPr>
         <w:t>та на підставі</w:t>
       </w:r>
-      <w:bookmarkEnd w:id="4"/>
+      <w:bookmarkEnd w:id="5"/>
       <w:r>
         <w:rPr>
           <w:sz w:val="28"/>
@@ -4133,7 +3463,6 @@
           <w:sz w:val="28"/>
           <w:szCs w:val="28"/>
         </w:rPr>
-        <w:lastRenderedPageBreak/>
         <w:t>4</w:t>
       </w:r>
       <w:r>
@@ -4203,7 +3532,25 @@
           <w:sz w:val="28"/>
           <w:szCs w:val="28"/>
         </w:rPr>
-        <w:t>та начальнику фінансово-економічної служби – головному бухгалтеру після надходження затвердженого єдиного акту списання військового майна, забезпечити списання з книги обліку втрат військового майна - кількості військового майна, на яку затверджено єдиний акт списання, з книги обліку нестач - суми втрат, віднесених на рахунок держави.</w:t>
+        <w:t xml:space="preserve">та начальнику фінансово-економічної служби – головному бухгалтеру після надходження затвердженого єдиного акту списання військового майна, забезпечити списання з книги обліку втрат військового майна - кількості військового майна, </w:t>
+      </w:r>
+      <w:proofErr w:type="gramStart"/>
+      <w:r>
+        <w:rPr>
+          <w:color w:val="000000" w:themeColor="text1"/>
+          <w:sz w:val="28"/>
+          <w:szCs w:val="28"/>
+        </w:rPr>
+        <w:t>на яку</w:t>
+      </w:r>
+      <w:proofErr w:type="gramEnd"/>
+      <w:r>
+        <w:rPr>
+          <w:color w:val="000000" w:themeColor="text1"/>
+          <w:sz w:val="28"/>
+          <w:szCs w:val="28"/>
+        </w:rPr>
+        <w:t xml:space="preserve"> затверджено єдиний акт списання, з книги обліку нестач - суми втрат, віднесених на рахунок держави.</w:t>
       </w:r>
       <w:r>
         <w:rPr>
@@ -4340,7 +3687,16 @@
           <w:sz w:val="28"/>
           <w:szCs w:val="28"/>
         </w:rPr>
-        <w:t>в частині, що його стосується.</w:t>
+        <w:t xml:space="preserve">в </w:t>
+      </w:r>
+      <w:r>
+        <w:rPr>
+          <w:color w:val="000000" w:themeColor="text1"/>
+          <w:sz w:val="28"/>
+          <w:szCs w:val="28"/>
+        </w:rPr>
+        <w:lastRenderedPageBreak/>
+        <w:t>частині, що його стосується.</w:t>
       </w:r>
     </w:p>
     <w:p>
@@ -4462,7 +3818,7 @@
         </w:rPr>
         <w:t>.</w:t>
       </w:r>
-      <w:bookmarkEnd w:id="5"/>
+      <w:bookmarkEnd w:id="6"/>
     </w:p>
     <w:p>
       <w:pPr>
@@ -7607,6 +6963,7 @@
   <w:style w:type="character" w:default="1" w:styleId="a0">
     <w:name w:val="Default Paragraph Font"/>
     <w:uiPriority w:val="1"/>
+    <w:semiHidden/>
     <w:unhideWhenUsed/>
   </w:style>
   <w:style w:type="table" w:default="1" w:styleId="a1">

</xml_diff>

<commit_message>
fix: replace dual NumericUpDown time input with MaskedTextBox, fix duplicate MergeField replacement, and extract hardcoded constants
- Replace EventHour/EventMinute properties and two NumericUpDown controls with a single EventTime string property and MaskedTextBox (Mask="00:00") for cleaner UX and correct architecture
- Fix ReplaceField to continue processing after first match in a paragraph (break → i = endIdx), so duplicate MergeFields in one paragraph are all replaced
- Fix ReplaceFieldWithBlock to insert block content at every placeholder occurrence, not only the first; second SERVICES_BLOCK was left empty before
- Add FontSize parameter to BlockParagraph record (default 14pt) instead of hardcoding "28" in ReplaceFieldWithBlock
- Extract all hardcoded literals in WriteOffOrderHelper method bodies into named private constants

Co-Authored-By: Claude Sonnet 4.6 <noreply@anthropic.com>
</commit_message>
<xml_diff>
--- a/Mil.Paperwork.Domain/Templates/WriteOffOrderTemplate.docx
+++ b/Mil.Paperwork.Domain/Templates/WriteOffOrderTemplate.docx
@@ -3273,25 +3273,34 @@
           <w:sz w:val="28"/>
           <w:szCs w:val="28"/>
         </w:rPr>
-        <w:t xml:space="preserve">відповідно до залишкової вартості знищеного майна в сумі </w:t>
-      </w:r>
-      <w:r>
-        <w:rPr>
-          <w:color w:val="000000" w:themeColor="text1"/>
-          <w:sz w:val="28"/>
-          <w:szCs w:val="28"/>
-          <w:lang w:val="ru-RU"/>
-        </w:rPr>
-        <w:fldChar w:fldCharType="begin"/>
-      </w:r>
-      <w:r>
-        <w:rPr>
-          <w:color w:val="000000" w:themeColor="text1"/>
-          <w:sz w:val="28"/>
-          <w:szCs w:val="28"/>
-          <w:lang w:val="ru-RU"/>
-        </w:rPr>
-        <w:instrText xml:space="preserve"> MERGEFIELD  TOTAL_SUM  \* MERGEFORMAT </w:instrText>
+        <w:t>відповідно до залишкової вартості знищеного майна в сумі</w:t>
+      </w:r>
+      <w:r>
+        <w:rPr>
+          <w:color w:val="000000" w:themeColor="text1"/>
+          <w:sz w:val="28"/>
+          <w:szCs w:val="28"/>
+          <w:lang w:val="ru-RU"/>
+        </w:rPr>
+        <w:t xml:space="preserve"> </w:t>
+      </w:r>
+      <w:r>
+        <w:rPr>
+          <w:color w:val="000000" w:themeColor="text1"/>
+          <w:sz w:val="28"/>
+          <w:szCs w:val="28"/>
+          <w:lang w:val="ru-RU"/>
+        </w:rPr>
+        <w:fldChar w:fldCharType="begin"/>
+      </w:r>
+      <w:r>
+        <w:rPr>
+          <w:color w:val="000000" w:themeColor="text1"/>
+          <w:sz w:val="28"/>
+          <w:szCs w:val="28"/>
+          <w:lang w:val="ru-RU"/>
+        </w:rPr>
+        <w:instrText xml:space="preserve"> MERGEFIELD  TOTAL_SUM_TEXT  \* MERGEFORMAT </w:instrText>
       </w:r>
       <w:r>
         <w:rPr>
@@ -3310,24 +3319,16 @@
           <w:szCs w:val="28"/>
           <w:lang w:val="ru-RU"/>
         </w:rPr>
-        <w:t>«TOTAL_SUM»</w:t>
-      </w:r>
-      <w:r>
-        <w:rPr>
-          <w:color w:val="000000" w:themeColor="text1"/>
-          <w:sz w:val="28"/>
-          <w:szCs w:val="28"/>
-          <w:lang w:val="ru-RU"/>
-        </w:rPr>
-        <w:fldChar w:fldCharType="end"/>
-      </w:r>
-      <w:r>
-        <w:rPr>
-          <w:color w:val="000000" w:themeColor="text1"/>
-          <w:sz w:val="28"/>
-          <w:szCs w:val="28"/>
-        </w:rPr>
-        <w:t xml:space="preserve">грн. </w:t>
+        <w:t>«TOTAL_SUM_TEXT»</w:t>
+      </w:r>
+      <w:r>
+        <w:rPr>
+          <w:color w:val="000000" w:themeColor="text1"/>
+          <w:sz w:val="28"/>
+          <w:szCs w:val="28"/>
+          <w:lang w:val="ru-RU"/>
+        </w:rPr>
+        <w:fldChar w:fldCharType="end"/>
       </w:r>
       <w:r>
         <w:rPr>
@@ -3336,25 +3337,105 @@
           <w:szCs w:val="28"/>
           <w:lang w:val="en-US"/>
         </w:rPr>
-        <w:t>(</w:t>
-      </w:r>
-      <w:r>
-        <w:rPr>
-          <w:color w:val="000000" w:themeColor="text1"/>
-          <w:sz w:val="28"/>
-          <w:szCs w:val="28"/>
-          <w:lang w:val="ru-RU"/>
-        </w:rPr>
-        <w:fldChar w:fldCharType="begin"/>
-      </w:r>
-      <w:r>
-        <w:rPr>
-          <w:color w:val="000000" w:themeColor="text1"/>
-          <w:sz w:val="28"/>
-          <w:szCs w:val="28"/>
-          <w:lang w:val="ru-RU"/>
-        </w:rPr>
-        <w:instrText xml:space="preserve"> MERGEFIELD  TOTAL_SUM_TEXT  \* MERGEFORMAT </w:instrText>
+        <w:t xml:space="preserve"> </w:t>
+      </w:r>
+      <w:r>
+        <w:rPr>
+          <w:color w:val="000000" w:themeColor="text1"/>
+          <w:sz w:val="28"/>
+          <w:szCs w:val="28"/>
+        </w:rPr>
+        <w:t xml:space="preserve">віднести </w:t>
+      </w:r>
+      <w:r>
+        <w:rPr>
+          <w:color w:val="000000" w:themeColor="text1"/>
+          <w:sz w:val="28"/>
+          <w:szCs w:val="28"/>
+        </w:rPr>
+        <w:t>на рахунок Держави</w:t>
+      </w:r>
+      <w:r>
+        <w:rPr>
+          <w:color w:val="000000" w:themeColor="text1"/>
+          <w:sz w:val="28"/>
+          <w:szCs w:val="28"/>
+        </w:rPr>
+        <w:t xml:space="preserve"> в повному обсязі</w:t>
+      </w:r>
+      <w:r>
+        <w:rPr>
+          <w:color w:val="000000" w:themeColor="text1"/>
+          <w:sz w:val="28"/>
+          <w:szCs w:val="28"/>
+        </w:rPr>
+        <w:t>.</w:t>
+      </w:r>
+    </w:p>
+    <w:p>
+      <w:pPr>
+        <w:ind w:firstLine="709"/>
+        <w:jc w:val="both"/>
+        <w:rPr>
+          <w:color w:val="000000" w:themeColor="text1"/>
+          <w:sz w:val="28"/>
+          <w:szCs w:val="28"/>
+        </w:rPr>
+      </w:pPr>
+    </w:p>
+    <w:p>
+      <w:pPr>
+        <w:jc w:val="both"/>
+        <w:rPr>
+          <w:color w:val="000000" w:themeColor="text1"/>
+          <w:sz w:val="28"/>
+          <w:szCs w:val="28"/>
+        </w:rPr>
+      </w:pPr>
+    </w:p>
+    <w:p>
+      <w:pPr>
+        <w:ind w:firstLine="709"/>
+        <w:jc w:val="both"/>
+        <w:rPr>
+          <w:color w:val="000000" w:themeColor="text1"/>
+          <w:sz w:val="28"/>
+          <w:szCs w:val="28"/>
+        </w:rPr>
+      </w:pPr>
+      <w:r>
+        <w:rPr>
+          <w:color w:val="000000" w:themeColor="text1"/>
+          <w:sz w:val="28"/>
+          <w:szCs w:val="28"/>
+        </w:rPr>
+        <w:t>4</w:t>
+      </w:r>
+      <w:r>
+        <w:rPr>
+          <w:color w:val="000000" w:themeColor="text1"/>
+          <w:sz w:val="28"/>
+          <w:szCs w:val="28"/>
+        </w:rPr>
+        <w:t>. </w:t>
+      </w:r>
+      <w:r>
+        <w:rPr>
+          <w:color w:val="000000" w:themeColor="text1"/>
+          <w:sz w:val="28"/>
+          <w:szCs w:val="28"/>
+          <w:lang w:val="ru-RU"/>
+        </w:rPr>
+        <w:fldChar w:fldCharType="begin"/>
+      </w:r>
+      <w:r>
+        <w:rPr>
+          <w:color w:val="000000" w:themeColor="text1"/>
+          <w:sz w:val="28"/>
+          <w:szCs w:val="28"/>
+          <w:lang w:val="ru-RU"/>
+        </w:rPr>
+        <w:instrText xml:space="preserve"> MERGEFIELD  TO_HEADS_OF_SERVICES \* FirstCap  \* MERGEFORMAT </w:instrText>
       </w:r>
       <w:r>
         <w:rPr>
@@ -3373,141 +3454,6 @@
           <w:szCs w:val="28"/>
           <w:lang w:val="ru-RU"/>
         </w:rPr>
-        <w:t>«TOTAL_SUM_TEXT»</w:t>
-      </w:r>
-      <w:r>
-        <w:rPr>
-          <w:color w:val="000000" w:themeColor="text1"/>
-          <w:sz w:val="28"/>
-          <w:szCs w:val="28"/>
-          <w:lang w:val="ru-RU"/>
-        </w:rPr>
-        <w:fldChar w:fldCharType="end"/>
-      </w:r>
-      <w:r>
-        <w:rPr>
-          <w:color w:val="000000" w:themeColor="text1"/>
-          <w:sz w:val="28"/>
-          <w:szCs w:val="28"/>
-          <w:lang w:val="en-US"/>
-        </w:rPr>
-        <w:t xml:space="preserve">) </w:t>
-      </w:r>
-      <w:r>
-        <w:rPr>
-          <w:color w:val="000000" w:themeColor="text1"/>
-          <w:sz w:val="28"/>
-          <w:szCs w:val="28"/>
-        </w:rPr>
-        <w:t xml:space="preserve">віднести </w:t>
-      </w:r>
-      <w:r>
-        <w:rPr>
-          <w:color w:val="000000" w:themeColor="text1"/>
-          <w:sz w:val="28"/>
-          <w:szCs w:val="28"/>
-        </w:rPr>
-        <w:t>на рахунок Держави</w:t>
-      </w:r>
-      <w:r>
-        <w:rPr>
-          <w:color w:val="000000" w:themeColor="text1"/>
-          <w:sz w:val="28"/>
-          <w:szCs w:val="28"/>
-        </w:rPr>
-        <w:t xml:space="preserve"> в повному обсязі</w:t>
-      </w:r>
-      <w:r>
-        <w:rPr>
-          <w:color w:val="000000" w:themeColor="text1"/>
-          <w:sz w:val="28"/>
-          <w:szCs w:val="28"/>
-        </w:rPr>
-        <w:t>.</w:t>
-      </w:r>
-    </w:p>
-    <w:p>
-      <w:pPr>
-        <w:ind w:firstLine="709"/>
-        <w:jc w:val="both"/>
-        <w:rPr>
-          <w:color w:val="000000" w:themeColor="text1"/>
-          <w:sz w:val="28"/>
-          <w:szCs w:val="28"/>
-        </w:rPr>
-      </w:pPr>
-    </w:p>
-    <w:p>
-      <w:pPr>
-        <w:jc w:val="both"/>
-        <w:rPr>
-          <w:color w:val="000000" w:themeColor="text1"/>
-          <w:sz w:val="28"/>
-          <w:szCs w:val="28"/>
-        </w:rPr>
-      </w:pPr>
-    </w:p>
-    <w:p>
-      <w:pPr>
-        <w:ind w:firstLine="709"/>
-        <w:jc w:val="both"/>
-        <w:rPr>
-          <w:color w:val="000000" w:themeColor="text1"/>
-          <w:sz w:val="28"/>
-          <w:szCs w:val="28"/>
-        </w:rPr>
-      </w:pPr>
-      <w:r>
-        <w:rPr>
-          <w:color w:val="000000" w:themeColor="text1"/>
-          <w:sz w:val="28"/>
-          <w:szCs w:val="28"/>
-        </w:rPr>
-        <w:t>4</w:t>
-      </w:r>
-      <w:r>
-        <w:rPr>
-          <w:color w:val="000000" w:themeColor="text1"/>
-          <w:sz w:val="28"/>
-          <w:szCs w:val="28"/>
-        </w:rPr>
-        <w:t>. </w:t>
-      </w:r>
-      <w:r>
-        <w:rPr>
-          <w:color w:val="000000" w:themeColor="text1"/>
-          <w:sz w:val="28"/>
-          <w:szCs w:val="28"/>
-          <w:lang w:val="ru-RU"/>
-        </w:rPr>
-        <w:fldChar w:fldCharType="begin"/>
-      </w:r>
-      <w:r>
-        <w:rPr>
-          <w:color w:val="000000" w:themeColor="text1"/>
-          <w:sz w:val="28"/>
-          <w:szCs w:val="28"/>
-          <w:lang w:val="ru-RU"/>
-        </w:rPr>
-        <w:instrText xml:space="preserve"> MERGEFIELD  TO_HEADS_OF_SERVICES  \* MERGEFORMAT </w:instrText>
-      </w:r>
-      <w:r>
-        <w:rPr>
-          <w:color w:val="000000" w:themeColor="text1"/>
-          <w:sz w:val="28"/>
-          <w:szCs w:val="28"/>
-          <w:lang w:val="ru-RU"/>
-        </w:rPr>
-        <w:fldChar w:fldCharType="separate"/>
-      </w:r>
-      <w:r>
-        <w:rPr>
-          <w:noProof/>
-          <w:color w:val="000000" w:themeColor="text1"/>
-          <w:sz w:val="28"/>
-          <w:szCs w:val="28"/>
-          <w:lang w:val="ru-RU"/>
-        </w:rPr>
         <w:t>«TO_HEADS_OF_SERVICES»</w:t>
       </w:r>
       <w:r>
@@ -3532,25 +3478,7 @@
           <w:sz w:val="28"/>
           <w:szCs w:val="28"/>
         </w:rPr>
-        <w:t xml:space="preserve">та начальнику фінансово-економічної служби – головному бухгалтеру після надходження затвердженого єдиного акту списання військового майна, забезпечити списання з книги обліку втрат військового майна - кількості військового майна, </w:t>
-      </w:r>
-      <w:proofErr w:type="gramStart"/>
-      <w:r>
-        <w:rPr>
-          <w:color w:val="000000" w:themeColor="text1"/>
-          <w:sz w:val="28"/>
-          <w:szCs w:val="28"/>
-        </w:rPr>
-        <w:t>на яку</w:t>
-      </w:r>
-      <w:proofErr w:type="gramEnd"/>
-      <w:r>
-        <w:rPr>
-          <w:color w:val="000000" w:themeColor="text1"/>
-          <w:sz w:val="28"/>
-          <w:szCs w:val="28"/>
-        </w:rPr>
-        <w:t xml:space="preserve"> затверджено єдиний акт списання, з книги обліку нестач - суми втрат, віднесених на рахунок держави.</w:t>
+        <w:t>та начальнику фінансово-економічної служби – головному бухгалтеру після надходження затвердженого єдиного акту списання військового майна, забезпечити списання з книги обліку втрат військового майна - кількості військового майна, на яку затверджено єдиний акт списання, з книги обліку нестач - суми втрат, віднесених на рахунок держави.</w:t>
       </w:r>
       <w:r>
         <w:rPr>
@@ -3687,16 +3615,7 @@
           <w:sz w:val="28"/>
           <w:szCs w:val="28"/>
         </w:rPr>
-        <w:t xml:space="preserve">в </w:t>
-      </w:r>
-      <w:r>
-        <w:rPr>
-          <w:color w:val="000000" w:themeColor="text1"/>
-          <w:sz w:val="28"/>
-          <w:szCs w:val="28"/>
-        </w:rPr>
-        <w:lastRenderedPageBreak/>
-        <w:t>частині, що його стосується.</w:t>
+        <w:t>в частині, що його стосується.</w:t>
       </w:r>
     </w:p>
     <w:p>

</xml_diff>